<commit_message>
feat: generate the contract LO from live offer data with visible merges
- Fill the ARF facility Letter of Offer from the sent offer, frozen product workflow, and saved authorised-representative draft so issuers can download a reviewable Word/PDF instead of a blank template.
- Require invoice sub-limit on LO products, fail generate when required commercial or party data is missing, and keep every merge value yellow-highlighted. Empty fields print the tag or legal placeholder. Finance Documents lists guarantors as i. ii. iii. with company reps nested as a. b. c., matching the 19 Aug clean copy spacing on signature blocks.
</commit_message>
<xml_diff>
--- a/apps/api/src/modules/applications/templates/01 LO (Clean Copy) 19 August 2026.docx
+++ b/apps/api/src/modules/applications/templates/01 LO (Clean Copy) 19 August 2026.docx
@@ -1,6 +1,6 @@
 
 <file path=word/document.xml><?xml version="1.0" encoding="utf-8"?>
-<w:document xmlns:wpc="http://schemas.microsoft.com/office/word/2010/wordprocessingCanvas" xmlns:cx="http://schemas.microsoft.com/office/drawing/2014/chartex" xmlns:cx1="http://schemas.microsoft.com/office/drawing/2015/9/8/chartex" xmlns:cx2="http://schemas.microsoft.com/office/drawing/2015/10/21/chartex" xmlns:cx3="http://schemas.microsoft.com/office/drawing/2016/5/9/chartex" xmlns:cx4="http://schemas.microsoft.com/office/drawing/2016/5/10/chartex" xmlns:cx5="http://schemas.microsoft.com/office/drawing/2016/5/11/chartex" xmlns:cx6="http://schemas.microsoft.com/office/drawing/2016/5/12/chartex" xmlns:cx7="http://schemas.microsoft.com/office/drawing/2016/5/13/chartex" xmlns:cx8="http://schemas.microsoft.com/office/drawing/2016/5/14/chartex" xmlns:mc="http://schemas.openxmlformats.org/markup-compatibility/2006" xmlns:m="http://schemas.openxmlformats.org/officeDocument/2006/math" xmlns:aink="http://schemas.microsoft.com/office/drawing/2016/ink" xmlns:am3d="http://schemas.microsoft.com/office/drawing/2017/model3d" xmlns:oel="http://schemas.microsoft.com/office/2019/extlst" xmlns:r="http://schemas.openxmlformats.org/officeDocument/2006/relationships" xmlns:wp14="http://schemas.microsoft.com/office/word/2010/wordprocessingDrawing" xmlns:wp="http://schemas.openxmlformats.org/drawingml/2006/wordprocessingDrawing" xmlns:wpg="http://schemas.microsoft.com/office/word/2010/wordprocessingGroup" xmlns:wpi="http://schemas.microsoft.com/office/word/2010/wordprocessingInk" xmlns:wps="http://schemas.microsoft.com/office/word/2010/wordprocessingShape" xmlns:o="urn:schemas-microsoft-com:office:office" xmlns:v="urn:schemas-microsoft-com:vml" xmlns:w10="urn:schemas-microsoft-com:office:word" xmlns:w="http://schemas.openxmlformats.org/wordprocessingml/2006/main" xmlns:w14="http://schemas.microsoft.com/office/word/2010/wordml" xmlns:w15="http://schemas.microsoft.com/office/word/2012/wordml" xmlns:w16cex="http://schemas.microsoft.com/office/word/2018/wordml/cex" xmlns:w16cid="http://schemas.microsoft.com/office/word/2016/wordml/cid" xmlns:w16="http://schemas.microsoft.com/office/word/2018/wordml" xmlns:w16sdtdh="http://schemas.microsoft.com/office/word/2020/wordml/sdtdatahash" xmlns:w16sdtfl="http://schemas.microsoft.com/office/word/2024/wordml/sdtformatlock" xmlns:w16se="http://schemas.microsoft.com/office/word/2015/wordml/symex" xmlns:w16du="http://schemas.microsoft.com/office/word/2023/wordml/word16du" xmlns:wne="http://schemas.microsoft.com/office/word/2006/wordml" mc:Ignorable="w14 w15 w16se w16cid w16 w16cex w16sdtdh w16sdtfl w16du wp14">
+<w:document xmlns:wpc="http://schemas.microsoft.com/office/word/2010/wordprocessingCanvas" xmlns:cx="http://schemas.microsoft.com/office/drawing/2014/chartex" xmlns:cx1="http://schemas.microsoft.com/office/drawing/2015/9/8/chartex" xmlns:cx2="http://schemas.microsoft.com/office/drawing/2015/10/21/chartex" xmlns:cx3="http://schemas.microsoft.com/office/drawing/2016/5/9/chartex" xmlns:cx4="http://schemas.microsoft.com/office/drawing/2016/5/10/chartex" xmlns:cx5="http://schemas.microsoft.com/office/drawing/2016/5/11/chartex" xmlns:cx6="http://schemas.microsoft.com/office/drawing/2016/5/12/chartex" xmlns:cx7="http://schemas.microsoft.com/office/drawing/2016/5/13/chartex" xmlns:cx8="http://schemas.microsoft.com/office/drawing/2016/5/14/chartex" xmlns:mc="http://schemas.openxmlformats.org/markup-compatibility/2006" xmlns:aink="http://schemas.microsoft.com/office/drawing/2016/ink" xmlns:am3d="http://schemas.microsoft.com/office/drawing/2017/model3d" xmlns:o="urn:schemas-microsoft-com:office:office" xmlns:oel="http://schemas.microsoft.com/office/2019/extlst" xmlns:r="http://schemas.openxmlformats.org/officeDocument/2006/relationships" xmlns:m="http://schemas.openxmlformats.org/officeDocument/2006/math" xmlns:v="urn:schemas-microsoft-com:vml" xmlns:wp14="http://schemas.microsoft.com/office/word/2010/wordprocessingDrawing" xmlns:wp="http://schemas.openxmlformats.org/drawingml/2006/wordprocessingDrawing" xmlns:w10="urn:schemas-microsoft-com:office:word" xmlns:w="http://schemas.openxmlformats.org/wordprocessingml/2006/main" xmlns:w14="http://schemas.microsoft.com/office/word/2010/wordml" xmlns:w15="http://schemas.microsoft.com/office/word/2012/wordml" xmlns:w16cex="http://schemas.microsoft.com/office/word/2018/wordml/cex" xmlns:w16cid="http://schemas.microsoft.com/office/word/2016/wordml/cid" xmlns:w16="http://schemas.microsoft.com/office/word/2018/wordml" xmlns:w16du="http://schemas.microsoft.com/office/word/2023/wordml/word16du" xmlns:w16sdtdh="http://schemas.microsoft.com/office/word/2020/wordml/sdtdatahash" xmlns:w16sdtfl="http://schemas.microsoft.com/office/word/2024/wordml/sdtformatlock" xmlns:w16se="http://schemas.microsoft.com/office/word/2015/wordml/symex" xmlns:wpg="http://schemas.microsoft.com/office/word/2010/wordprocessingGroup" xmlns:wpi="http://schemas.microsoft.com/office/word/2010/wordprocessingInk" xmlns:wne="http://schemas.microsoft.com/office/word/2006/wordml" xmlns:wps="http://schemas.microsoft.com/office/word/2010/wordprocessingShape" mc:Ignorable="w14 w15 w16se w16cid w16 w16cex w16sdtdh w16sdtfl w16du wp14">
   <w:body>
     <w:p>
       <w:pPr>
@@ -5532,13 +5532,6 @@
         <w:spacing w:line="360" w:lineRule="auto"/>
         <w:jc w:val="both"/>
       </w:pPr>
-      <w:r>
-        <w:rPr>
-          <w:sz w:val="20"/>
-          <w:szCs w:val="20"/>
-        </w:rPr>
-        <w:t xml:space="preserve"> </w:t>
-      </w:r>
       <w:proofErr w:type="gramStart"/>
       <w:r>
         <w:rPr>
@@ -16266,7 +16259,7 @@
 </file>
 
 <file path=word/endnotes.xml><?xml version="1.0" encoding="utf-8"?>
-<w:endnotes xmlns:wpc="http://schemas.microsoft.com/office/word/2010/wordprocessingCanvas" xmlns:cx="http://schemas.microsoft.com/office/drawing/2014/chartex" xmlns:cx1="http://schemas.microsoft.com/office/drawing/2015/9/8/chartex" xmlns:cx2="http://schemas.microsoft.com/office/drawing/2015/10/21/chartex" xmlns:cx3="http://schemas.microsoft.com/office/drawing/2016/5/9/chartex" xmlns:cx4="http://schemas.microsoft.com/office/drawing/2016/5/10/chartex" xmlns:cx5="http://schemas.microsoft.com/office/drawing/2016/5/11/chartex" xmlns:cx6="http://schemas.microsoft.com/office/drawing/2016/5/12/chartex" xmlns:cx7="http://schemas.microsoft.com/office/drawing/2016/5/13/chartex" xmlns:cx8="http://schemas.microsoft.com/office/drawing/2016/5/14/chartex" xmlns:mc="http://schemas.openxmlformats.org/markup-compatibility/2006" xmlns:m="http://schemas.openxmlformats.org/officeDocument/2006/math" xmlns:aink="http://schemas.microsoft.com/office/drawing/2016/ink" xmlns:am3d="http://schemas.microsoft.com/office/drawing/2017/model3d" xmlns:oel="http://schemas.microsoft.com/office/2019/extlst" xmlns:r="http://schemas.openxmlformats.org/officeDocument/2006/relationships" xmlns:wp14="http://schemas.microsoft.com/office/word/2010/wordprocessingDrawing" xmlns:wp="http://schemas.openxmlformats.org/drawingml/2006/wordprocessingDrawing" xmlns:wpg="http://schemas.microsoft.com/office/word/2010/wordprocessingGroup" xmlns:wpi="http://schemas.microsoft.com/office/word/2010/wordprocessingInk" xmlns:wps="http://schemas.microsoft.com/office/word/2010/wordprocessingShape" xmlns:o="urn:schemas-microsoft-com:office:office" xmlns:v="urn:schemas-microsoft-com:vml" xmlns:w10="urn:schemas-microsoft-com:office:word" xmlns:w="http://schemas.openxmlformats.org/wordprocessingml/2006/main" xmlns:w14="http://schemas.microsoft.com/office/word/2010/wordml" xmlns:w15="http://schemas.microsoft.com/office/word/2012/wordml" xmlns:w16cex="http://schemas.microsoft.com/office/word/2018/wordml/cex" xmlns:w16cid="http://schemas.microsoft.com/office/word/2016/wordml/cid" xmlns:w16="http://schemas.microsoft.com/office/word/2018/wordml" xmlns:w16sdtdh="http://schemas.microsoft.com/office/word/2020/wordml/sdtdatahash" xmlns:w16sdtfl="http://schemas.microsoft.com/office/word/2024/wordml/sdtformatlock" xmlns:w16se="http://schemas.microsoft.com/office/word/2015/wordml/symex" xmlns:w16du="http://schemas.microsoft.com/office/word/2023/wordml/word16du" xmlns:wne="http://schemas.microsoft.com/office/word/2006/wordml" mc:Ignorable="w14 w15 w16se w16cid w16 w16cex w16sdtdh w16sdtfl w16du wp14">
+<w:endnotes xmlns:wpc="http://schemas.microsoft.com/office/word/2010/wordprocessingCanvas" xmlns:cx="http://schemas.microsoft.com/office/drawing/2014/chartex" xmlns:cx1="http://schemas.microsoft.com/office/drawing/2015/9/8/chartex" xmlns:cx2="http://schemas.microsoft.com/office/drawing/2015/10/21/chartex" xmlns:cx3="http://schemas.microsoft.com/office/drawing/2016/5/9/chartex" xmlns:cx4="http://schemas.microsoft.com/office/drawing/2016/5/10/chartex" xmlns:cx5="http://schemas.microsoft.com/office/drawing/2016/5/11/chartex" xmlns:cx6="http://schemas.microsoft.com/office/drawing/2016/5/12/chartex" xmlns:cx7="http://schemas.microsoft.com/office/drawing/2016/5/13/chartex" xmlns:cx8="http://schemas.microsoft.com/office/drawing/2016/5/14/chartex" xmlns:mc="http://schemas.openxmlformats.org/markup-compatibility/2006" xmlns:aink="http://schemas.microsoft.com/office/drawing/2016/ink" xmlns:am3d="http://schemas.microsoft.com/office/drawing/2017/model3d" xmlns:o="urn:schemas-microsoft-com:office:office" xmlns:oel="http://schemas.microsoft.com/office/2019/extlst" xmlns:r="http://schemas.openxmlformats.org/officeDocument/2006/relationships" xmlns:m="http://schemas.openxmlformats.org/officeDocument/2006/math" xmlns:v="urn:schemas-microsoft-com:vml" xmlns:wp14="http://schemas.microsoft.com/office/word/2010/wordprocessingDrawing" xmlns:wp="http://schemas.openxmlformats.org/drawingml/2006/wordprocessingDrawing" xmlns:w10="urn:schemas-microsoft-com:office:word" xmlns:w="http://schemas.openxmlformats.org/wordprocessingml/2006/main" xmlns:w14="http://schemas.microsoft.com/office/word/2010/wordml" xmlns:w15="http://schemas.microsoft.com/office/word/2012/wordml" xmlns:w16cex="http://schemas.microsoft.com/office/word/2018/wordml/cex" xmlns:w16cid="http://schemas.microsoft.com/office/word/2016/wordml/cid" xmlns:w16="http://schemas.microsoft.com/office/word/2018/wordml" xmlns:w16du="http://schemas.microsoft.com/office/word/2023/wordml/word16du" xmlns:w16sdtdh="http://schemas.microsoft.com/office/word/2020/wordml/sdtdatahash" xmlns:w16sdtfl="http://schemas.microsoft.com/office/word/2024/wordml/sdtformatlock" xmlns:w16se="http://schemas.microsoft.com/office/word/2015/wordml/symex" xmlns:wpg="http://schemas.microsoft.com/office/word/2010/wordprocessingGroup" xmlns:wpi="http://schemas.microsoft.com/office/word/2010/wordprocessingInk" xmlns:wne="http://schemas.microsoft.com/office/word/2006/wordml" xmlns:wps="http://schemas.microsoft.com/office/word/2010/wordprocessingShape" mc:Ignorable="w14 w15 w16se w16cid w16 w16cex w16sdtdh w16sdtfl w16du wp14">
   <w:endnote w:type="separator" w:id="-1">
     <w:p>
       <w:pPr>
@@ -16298,7 +16291,7 @@
 </file>
 
 <file path=word/footer1.xml><?xml version="1.0" encoding="utf-8"?>
-<w:ftr xmlns:wpc="http://schemas.microsoft.com/office/word/2010/wordprocessingCanvas" xmlns:cx="http://schemas.microsoft.com/office/drawing/2014/chartex" xmlns:cx1="http://schemas.microsoft.com/office/drawing/2015/9/8/chartex" xmlns:cx2="http://schemas.microsoft.com/office/drawing/2015/10/21/chartex" xmlns:cx3="http://schemas.microsoft.com/office/drawing/2016/5/9/chartex" xmlns:cx4="http://schemas.microsoft.com/office/drawing/2016/5/10/chartex" xmlns:cx5="http://schemas.microsoft.com/office/drawing/2016/5/11/chartex" xmlns:cx6="http://schemas.microsoft.com/office/drawing/2016/5/12/chartex" xmlns:cx7="http://schemas.microsoft.com/office/drawing/2016/5/13/chartex" xmlns:cx8="http://schemas.microsoft.com/office/drawing/2016/5/14/chartex" xmlns:mc="http://schemas.openxmlformats.org/markup-compatibility/2006" xmlns:m="http://schemas.openxmlformats.org/officeDocument/2006/math" xmlns:aink="http://schemas.microsoft.com/office/drawing/2016/ink" xmlns:am3d="http://schemas.microsoft.com/office/drawing/2017/model3d" xmlns:oel="http://schemas.microsoft.com/office/2019/extlst" xmlns:r="http://schemas.openxmlformats.org/officeDocument/2006/relationships" xmlns:wp14="http://schemas.microsoft.com/office/word/2010/wordprocessingDrawing" xmlns:wp="http://schemas.openxmlformats.org/drawingml/2006/wordprocessingDrawing" xmlns:wpg="http://schemas.microsoft.com/office/word/2010/wordprocessingGroup" xmlns:wpi="http://schemas.microsoft.com/office/word/2010/wordprocessingInk" xmlns:wps="http://schemas.microsoft.com/office/word/2010/wordprocessingShape" xmlns:o="urn:schemas-microsoft-com:office:office" xmlns:v="urn:schemas-microsoft-com:vml" xmlns:w10="urn:schemas-microsoft-com:office:word" xmlns:w="http://schemas.openxmlformats.org/wordprocessingml/2006/main" xmlns:w14="http://schemas.microsoft.com/office/word/2010/wordml" xmlns:w15="http://schemas.microsoft.com/office/word/2012/wordml" xmlns:w16cex="http://schemas.microsoft.com/office/word/2018/wordml/cex" xmlns:w16cid="http://schemas.microsoft.com/office/word/2016/wordml/cid" xmlns:w16="http://schemas.microsoft.com/office/word/2018/wordml" xmlns:w16sdtdh="http://schemas.microsoft.com/office/word/2020/wordml/sdtdatahash" xmlns:w16sdtfl="http://schemas.microsoft.com/office/word/2024/wordml/sdtformatlock" xmlns:w16se="http://schemas.microsoft.com/office/word/2015/wordml/symex" xmlns:w16du="http://schemas.microsoft.com/office/word/2023/wordml/word16du" xmlns:wne="http://schemas.microsoft.com/office/word/2006/wordml" mc:Ignorable="w14 w15 w16se w16cid w16 w16cex w16sdtdh w16sdtfl w16du wp14">
+<w:ftr xmlns:wpc="http://schemas.microsoft.com/office/word/2010/wordprocessingCanvas" xmlns:cx="http://schemas.microsoft.com/office/drawing/2014/chartex" xmlns:cx1="http://schemas.microsoft.com/office/drawing/2015/9/8/chartex" xmlns:cx2="http://schemas.microsoft.com/office/drawing/2015/10/21/chartex" xmlns:cx3="http://schemas.microsoft.com/office/drawing/2016/5/9/chartex" xmlns:cx4="http://schemas.microsoft.com/office/drawing/2016/5/10/chartex" xmlns:cx5="http://schemas.microsoft.com/office/drawing/2016/5/11/chartex" xmlns:cx6="http://schemas.microsoft.com/office/drawing/2016/5/12/chartex" xmlns:cx7="http://schemas.microsoft.com/office/drawing/2016/5/13/chartex" xmlns:cx8="http://schemas.microsoft.com/office/drawing/2016/5/14/chartex" xmlns:mc="http://schemas.openxmlformats.org/markup-compatibility/2006" xmlns:aink="http://schemas.microsoft.com/office/drawing/2016/ink" xmlns:am3d="http://schemas.microsoft.com/office/drawing/2017/model3d" xmlns:o="urn:schemas-microsoft-com:office:office" xmlns:oel="http://schemas.microsoft.com/office/2019/extlst" xmlns:r="http://schemas.openxmlformats.org/officeDocument/2006/relationships" xmlns:m="http://schemas.openxmlformats.org/officeDocument/2006/math" xmlns:v="urn:schemas-microsoft-com:vml" xmlns:wp14="http://schemas.microsoft.com/office/word/2010/wordprocessingDrawing" xmlns:wp="http://schemas.openxmlformats.org/drawingml/2006/wordprocessingDrawing" xmlns:w10="urn:schemas-microsoft-com:office:word" xmlns:w="http://schemas.openxmlformats.org/wordprocessingml/2006/main" xmlns:w14="http://schemas.microsoft.com/office/word/2010/wordml" xmlns:w15="http://schemas.microsoft.com/office/word/2012/wordml" xmlns:w16cex="http://schemas.microsoft.com/office/word/2018/wordml/cex" xmlns:w16cid="http://schemas.microsoft.com/office/word/2016/wordml/cid" xmlns:w16="http://schemas.microsoft.com/office/word/2018/wordml" xmlns:w16du="http://schemas.microsoft.com/office/word/2023/wordml/word16du" xmlns:w16sdtdh="http://schemas.microsoft.com/office/word/2020/wordml/sdtdatahash" xmlns:w16sdtfl="http://schemas.microsoft.com/office/word/2024/wordml/sdtformatlock" xmlns:w16se="http://schemas.microsoft.com/office/word/2015/wordml/symex" xmlns:wpg="http://schemas.microsoft.com/office/word/2010/wordprocessingGroup" xmlns:wpi="http://schemas.microsoft.com/office/word/2010/wordprocessingInk" xmlns:wne="http://schemas.microsoft.com/office/word/2006/wordml" xmlns:wps="http://schemas.microsoft.com/office/word/2010/wordprocessingShape" mc:Ignorable="w14 w15 w16se w16cid w16 w16cex w16sdtdh w16sdtfl w16du wp14">
   <w:sdt>
     <w:sdtPr>
       <w:id w:val="1458836867"/>
@@ -16385,7 +16378,7 @@
 </file>
 
 <file path=word/footnotes.xml><?xml version="1.0" encoding="utf-8"?>
-<w:footnotes xmlns:wpc="http://schemas.microsoft.com/office/word/2010/wordprocessingCanvas" xmlns:cx="http://schemas.microsoft.com/office/drawing/2014/chartex" xmlns:cx1="http://schemas.microsoft.com/office/drawing/2015/9/8/chartex" xmlns:cx2="http://schemas.microsoft.com/office/drawing/2015/10/21/chartex" xmlns:cx3="http://schemas.microsoft.com/office/drawing/2016/5/9/chartex" xmlns:cx4="http://schemas.microsoft.com/office/drawing/2016/5/10/chartex" xmlns:cx5="http://schemas.microsoft.com/office/drawing/2016/5/11/chartex" xmlns:cx6="http://schemas.microsoft.com/office/drawing/2016/5/12/chartex" xmlns:cx7="http://schemas.microsoft.com/office/drawing/2016/5/13/chartex" xmlns:cx8="http://schemas.microsoft.com/office/drawing/2016/5/14/chartex" xmlns:mc="http://schemas.openxmlformats.org/markup-compatibility/2006" xmlns:m="http://schemas.openxmlformats.org/officeDocument/2006/math" xmlns:aink="http://schemas.microsoft.com/office/drawing/2016/ink" xmlns:am3d="http://schemas.microsoft.com/office/drawing/2017/model3d" xmlns:oel="http://schemas.microsoft.com/office/2019/extlst" xmlns:r="http://schemas.openxmlformats.org/officeDocument/2006/relationships" xmlns:wp14="http://schemas.microsoft.com/office/word/2010/wordprocessingDrawing" xmlns:wp="http://schemas.openxmlformats.org/drawingml/2006/wordprocessingDrawing" xmlns:wpg="http://schemas.microsoft.com/office/word/2010/wordprocessingGroup" xmlns:wpi="http://schemas.microsoft.com/office/word/2010/wordprocessingInk" xmlns:wps="http://schemas.microsoft.com/office/word/2010/wordprocessingShape" xmlns:o="urn:schemas-microsoft-com:office:office" xmlns:v="urn:schemas-microsoft-com:vml" xmlns:w10="urn:schemas-microsoft-com:office:word" xmlns:w="http://schemas.openxmlformats.org/wordprocessingml/2006/main" xmlns:w14="http://schemas.microsoft.com/office/word/2010/wordml" xmlns:w15="http://schemas.microsoft.com/office/word/2012/wordml" xmlns:w16cex="http://schemas.microsoft.com/office/word/2018/wordml/cex" xmlns:w16cid="http://schemas.microsoft.com/office/word/2016/wordml/cid" xmlns:w16="http://schemas.microsoft.com/office/word/2018/wordml" xmlns:w16sdtdh="http://schemas.microsoft.com/office/word/2020/wordml/sdtdatahash" xmlns:w16sdtfl="http://schemas.microsoft.com/office/word/2024/wordml/sdtformatlock" xmlns:w16se="http://schemas.microsoft.com/office/word/2015/wordml/symex" xmlns:w16du="http://schemas.microsoft.com/office/word/2023/wordml/word16du" xmlns:wne="http://schemas.microsoft.com/office/word/2006/wordml" mc:Ignorable="w14 w15 w16se w16cid w16 w16cex w16sdtdh w16sdtfl w16du wp14">
+<w:footnotes xmlns:wpc="http://schemas.microsoft.com/office/word/2010/wordprocessingCanvas" xmlns:cx="http://schemas.microsoft.com/office/drawing/2014/chartex" xmlns:cx1="http://schemas.microsoft.com/office/drawing/2015/9/8/chartex" xmlns:cx2="http://schemas.microsoft.com/office/drawing/2015/10/21/chartex" xmlns:cx3="http://schemas.microsoft.com/office/drawing/2016/5/9/chartex" xmlns:cx4="http://schemas.microsoft.com/office/drawing/2016/5/10/chartex" xmlns:cx5="http://schemas.microsoft.com/office/drawing/2016/5/11/chartex" xmlns:cx6="http://schemas.microsoft.com/office/drawing/2016/5/12/chartex" xmlns:cx7="http://schemas.microsoft.com/office/drawing/2016/5/13/chartex" xmlns:cx8="http://schemas.microsoft.com/office/drawing/2016/5/14/chartex" xmlns:mc="http://schemas.openxmlformats.org/markup-compatibility/2006" xmlns:aink="http://schemas.microsoft.com/office/drawing/2016/ink" xmlns:am3d="http://schemas.microsoft.com/office/drawing/2017/model3d" xmlns:o="urn:schemas-microsoft-com:office:office" xmlns:oel="http://schemas.microsoft.com/office/2019/extlst" xmlns:r="http://schemas.openxmlformats.org/officeDocument/2006/relationships" xmlns:m="http://schemas.openxmlformats.org/officeDocument/2006/math" xmlns:v="urn:schemas-microsoft-com:vml" xmlns:wp14="http://schemas.microsoft.com/office/word/2010/wordprocessingDrawing" xmlns:wp="http://schemas.openxmlformats.org/drawingml/2006/wordprocessingDrawing" xmlns:w10="urn:schemas-microsoft-com:office:word" xmlns:w="http://schemas.openxmlformats.org/wordprocessingml/2006/main" xmlns:w14="http://schemas.microsoft.com/office/word/2010/wordml" xmlns:w15="http://schemas.microsoft.com/office/word/2012/wordml" xmlns:w16cex="http://schemas.microsoft.com/office/word/2018/wordml/cex" xmlns:w16cid="http://schemas.microsoft.com/office/word/2016/wordml/cid" xmlns:w16="http://schemas.microsoft.com/office/word/2018/wordml" xmlns:w16du="http://schemas.microsoft.com/office/word/2023/wordml/word16du" xmlns:w16sdtdh="http://schemas.microsoft.com/office/word/2020/wordml/sdtdatahash" xmlns:w16sdtfl="http://schemas.microsoft.com/office/word/2024/wordml/sdtformatlock" xmlns:w16se="http://schemas.microsoft.com/office/word/2015/wordml/symex" xmlns:wpg="http://schemas.microsoft.com/office/word/2010/wordprocessingGroup" xmlns:wpi="http://schemas.microsoft.com/office/word/2010/wordprocessingInk" xmlns:wne="http://schemas.microsoft.com/office/word/2006/wordml" xmlns:wps="http://schemas.microsoft.com/office/word/2010/wordprocessingShape" mc:Ignorable="w14 w15 w16se w16cid w16 w16cex w16sdtdh w16sdtfl w16du wp14">
   <w:footnote w:type="separator" w:id="-1">
     <w:p>
       <w:pPr>
@@ -16417,7 +16410,7 @@
 </file>
 
 <file path=word/header1.xml><?xml version="1.0" encoding="utf-8"?>
-<w:hdr xmlns:wpc="http://schemas.microsoft.com/office/word/2010/wordprocessingCanvas" xmlns:cx="http://schemas.microsoft.com/office/drawing/2014/chartex" xmlns:cx1="http://schemas.microsoft.com/office/drawing/2015/9/8/chartex" xmlns:cx2="http://schemas.microsoft.com/office/drawing/2015/10/21/chartex" xmlns:cx3="http://schemas.microsoft.com/office/drawing/2016/5/9/chartex" xmlns:cx4="http://schemas.microsoft.com/office/drawing/2016/5/10/chartex" xmlns:cx5="http://schemas.microsoft.com/office/drawing/2016/5/11/chartex" xmlns:cx6="http://schemas.microsoft.com/office/drawing/2016/5/12/chartex" xmlns:cx7="http://schemas.microsoft.com/office/drawing/2016/5/13/chartex" xmlns:cx8="http://schemas.microsoft.com/office/drawing/2016/5/14/chartex" xmlns:mc="http://schemas.openxmlformats.org/markup-compatibility/2006" xmlns:m="http://schemas.openxmlformats.org/officeDocument/2006/math" xmlns:aink="http://schemas.microsoft.com/office/drawing/2016/ink" xmlns:am3d="http://schemas.microsoft.com/office/drawing/2017/model3d" xmlns:oel="http://schemas.microsoft.com/office/2019/extlst" xmlns:r="http://schemas.openxmlformats.org/officeDocument/2006/relationships" xmlns:wp14="http://schemas.microsoft.com/office/word/2010/wordprocessingDrawing" xmlns:wp="http://schemas.openxmlformats.org/drawingml/2006/wordprocessingDrawing" xmlns:wpg="http://schemas.microsoft.com/office/word/2010/wordprocessingGroup" xmlns:wpi="http://schemas.microsoft.com/office/word/2010/wordprocessingInk" xmlns:wps="http://schemas.microsoft.com/office/word/2010/wordprocessingShape" xmlns:o="urn:schemas-microsoft-com:office:office" xmlns:v="urn:schemas-microsoft-com:vml" xmlns:w10="urn:schemas-microsoft-com:office:word" xmlns:w="http://schemas.openxmlformats.org/wordprocessingml/2006/main" xmlns:w14="http://schemas.microsoft.com/office/word/2010/wordml" xmlns:w15="http://schemas.microsoft.com/office/word/2012/wordml" xmlns:w16cex="http://schemas.microsoft.com/office/word/2018/wordml/cex" xmlns:w16cid="http://schemas.microsoft.com/office/word/2016/wordml/cid" xmlns:w16="http://schemas.microsoft.com/office/word/2018/wordml" xmlns:w16sdtdh="http://schemas.microsoft.com/office/word/2020/wordml/sdtdatahash" xmlns:w16sdtfl="http://schemas.microsoft.com/office/word/2024/wordml/sdtformatlock" xmlns:w16se="http://schemas.microsoft.com/office/word/2015/wordml/symex" xmlns:w16du="http://schemas.microsoft.com/office/word/2023/wordml/word16du" xmlns:wne="http://schemas.microsoft.com/office/word/2006/wordml" mc:Ignorable="w14 w15 w16se w16cid w16 w16cex w16sdtdh w16sdtfl w16du wp14">
+<w:hdr xmlns:wpc="http://schemas.microsoft.com/office/word/2010/wordprocessingCanvas" xmlns:cx="http://schemas.microsoft.com/office/drawing/2014/chartex" xmlns:cx1="http://schemas.microsoft.com/office/drawing/2015/9/8/chartex" xmlns:cx2="http://schemas.microsoft.com/office/drawing/2015/10/21/chartex" xmlns:cx3="http://schemas.microsoft.com/office/drawing/2016/5/9/chartex" xmlns:cx4="http://schemas.microsoft.com/office/drawing/2016/5/10/chartex" xmlns:cx5="http://schemas.microsoft.com/office/drawing/2016/5/11/chartex" xmlns:cx6="http://schemas.microsoft.com/office/drawing/2016/5/12/chartex" xmlns:cx7="http://schemas.microsoft.com/office/drawing/2016/5/13/chartex" xmlns:cx8="http://schemas.microsoft.com/office/drawing/2016/5/14/chartex" xmlns:mc="http://schemas.openxmlformats.org/markup-compatibility/2006" xmlns:aink="http://schemas.microsoft.com/office/drawing/2016/ink" xmlns:am3d="http://schemas.microsoft.com/office/drawing/2017/model3d" xmlns:o="urn:schemas-microsoft-com:office:office" xmlns:oel="http://schemas.microsoft.com/office/2019/extlst" xmlns:r="http://schemas.openxmlformats.org/officeDocument/2006/relationships" xmlns:m="http://schemas.openxmlformats.org/officeDocument/2006/math" xmlns:v="urn:schemas-microsoft-com:vml" xmlns:wp14="http://schemas.microsoft.com/office/word/2010/wordprocessingDrawing" xmlns:wp="http://schemas.openxmlformats.org/drawingml/2006/wordprocessingDrawing" xmlns:w10="urn:schemas-microsoft-com:office:word" xmlns:w="http://schemas.openxmlformats.org/wordprocessingml/2006/main" xmlns:w14="http://schemas.microsoft.com/office/word/2010/wordml" xmlns:w15="http://schemas.microsoft.com/office/word/2012/wordml" xmlns:w16cex="http://schemas.microsoft.com/office/word/2018/wordml/cex" xmlns:w16cid="http://schemas.microsoft.com/office/word/2016/wordml/cid" xmlns:w16="http://schemas.microsoft.com/office/word/2018/wordml" xmlns:w16du="http://schemas.microsoft.com/office/word/2023/wordml/word16du" xmlns:w16sdtdh="http://schemas.microsoft.com/office/word/2020/wordml/sdtdatahash" xmlns:w16sdtfl="http://schemas.microsoft.com/office/word/2024/wordml/sdtformatlock" xmlns:w16se="http://schemas.microsoft.com/office/word/2015/wordml/symex" xmlns:wpg="http://schemas.microsoft.com/office/word/2010/wordprocessingGroup" xmlns:wpi="http://schemas.microsoft.com/office/word/2010/wordprocessingInk" xmlns:wne="http://schemas.microsoft.com/office/word/2006/wordml" xmlns:wps="http://schemas.microsoft.com/office/word/2010/wordprocessingShape" mc:Ignorable="w14 w15 w16se w16cid w16 w16cex w16sdtdh w16sdtfl w16du wp14">
   <w:p>
     <w:pPr>
       <w:pStyle w:val="Header"/>
@@ -16492,7 +16485,7 @@
 </file>
 
 <file path=word/numbering.xml><?xml version="1.0" encoding="utf-8"?>
-<w:numbering xmlns:wpc="http://schemas.microsoft.com/office/word/2010/wordprocessingCanvas" xmlns:cx="http://schemas.microsoft.com/office/drawing/2014/chartex" xmlns:cx1="http://schemas.microsoft.com/office/drawing/2015/9/8/chartex" xmlns:cx2="http://schemas.microsoft.com/office/drawing/2015/10/21/chartex" xmlns:cx3="http://schemas.microsoft.com/office/drawing/2016/5/9/chartex" xmlns:cx4="http://schemas.microsoft.com/office/drawing/2016/5/10/chartex" xmlns:cx5="http://schemas.microsoft.com/office/drawing/2016/5/11/chartex" xmlns:cx6="http://schemas.microsoft.com/office/drawing/2016/5/12/chartex" xmlns:cx7="http://schemas.microsoft.com/office/drawing/2016/5/13/chartex" xmlns:cx8="http://schemas.microsoft.com/office/drawing/2016/5/14/chartex" xmlns:mc="http://schemas.openxmlformats.org/markup-compatibility/2006" xmlns:m="http://schemas.openxmlformats.org/officeDocument/2006/math" xmlns:aink="http://schemas.microsoft.com/office/drawing/2016/ink" xmlns:am3d="http://schemas.microsoft.com/office/drawing/2017/model3d" xmlns:oel="http://schemas.microsoft.com/office/2019/extlst" xmlns:r="http://schemas.openxmlformats.org/officeDocument/2006/relationships" xmlns:wp14="http://schemas.microsoft.com/office/word/2010/wordprocessingDrawing" xmlns:wp="http://schemas.openxmlformats.org/drawingml/2006/wordprocessingDrawing" xmlns:wpg="http://schemas.microsoft.com/office/word/2010/wordprocessingGroup" xmlns:wpi="http://schemas.microsoft.com/office/word/2010/wordprocessingInk" xmlns:wps="http://schemas.microsoft.com/office/word/2010/wordprocessingShape" xmlns:o="urn:schemas-microsoft-com:office:office" xmlns:v="urn:schemas-microsoft-com:vml" xmlns:w10="urn:schemas-microsoft-com:office:word" xmlns:w="http://schemas.openxmlformats.org/wordprocessingml/2006/main" xmlns:w14="http://schemas.microsoft.com/office/word/2010/wordml" xmlns:w15="http://schemas.microsoft.com/office/word/2012/wordml" xmlns:w16cex="http://schemas.microsoft.com/office/word/2018/wordml/cex" xmlns:w16cid="http://schemas.microsoft.com/office/word/2016/wordml/cid" xmlns:w16="http://schemas.microsoft.com/office/word/2018/wordml" xmlns:w16sdtdh="http://schemas.microsoft.com/office/word/2020/wordml/sdtdatahash" xmlns:w16sdtfl="http://schemas.microsoft.com/office/word/2024/wordml/sdtformatlock" xmlns:w16se="http://schemas.microsoft.com/office/word/2015/wordml/symex" xmlns:w16du="http://schemas.microsoft.com/office/word/2023/wordml/word16du" xmlns:wne="http://schemas.microsoft.com/office/word/2006/wordml" mc:Ignorable="w14 w15 w16se w16cid w16 w16cex w16sdtdh w16sdtfl w16du wp14">
+<w:numbering xmlns:wpc="http://schemas.microsoft.com/office/word/2010/wordprocessingCanvas" xmlns:cx="http://schemas.microsoft.com/office/drawing/2014/chartex" xmlns:cx1="http://schemas.microsoft.com/office/drawing/2015/9/8/chartex" xmlns:cx2="http://schemas.microsoft.com/office/drawing/2015/10/21/chartex" xmlns:cx3="http://schemas.microsoft.com/office/drawing/2016/5/9/chartex" xmlns:cx4="http://schemas.microsoft.com/office/drawing/2016/5/10/chartex" xmlns:cx5="http://schemas.microsoft.com/office/drawing/2016/5/11/chartex" xmlns:cx6="http://schemas.microsoft.com/office/drawing/2016/5/12/chartex" xmlns:cx7="http://schemas.microsoft.com/office/drawing/2016/5/13/chartex" xmlns:cx8="http://schemas.microsoft.com/office/drawing/2016/5/14/chartex" xmlns:mc="http://schemas.openxmlformats.org/markup-compatibility/2006" xmlns:aink="http://schemas.microsoft.com/office/drawing/2016/ink" xmlns:am3d="http://schemas.microsoft.com/office/drawing/2017/model3d" xmlns:o="urn:schemas-microsoft-com:office:office" xmlns:oel="http://schemas.microsoft.com/office/2019/extlst" xmlns:r="http://schemas.openxmlformats.org/officeDocument/2006/relationships" xmlns:m="http://schemas.openxmlformats.org/officeDocument/2006/math" xmlns:v="urn:schemas-microsoft-com:vml" xmlns:wp14="http://schemas.microsoft.com/office/word/2010/wordprocessingDrawing" xmlns:wp="http://schemas.openxmlformats.org/drawingml/2006/wordprocessingDrawing" xmlns:w10="urn:schemas-microsoft-com:office:word" xmlns:w="http://schemas.openxmlformats.org/wordprocessingml/2006/main" xmlns:w14="http://schemas.microsoft.com/office/word/2010/wordml" xmlns:w15="http://schemas.microsoft.com/office/word/2012/wordml" xmlns:w16cex="http://schemas.microsoft.com/office/word/2018/wordml/cex" xmlns:w16cid="http://schemas.microsoft.com/office/word/2016/wordml/cid" xmlns:w16="http://schemas.microsoft.com/office/word/2018/wordml" xmlns:w16du="http://schemas.microsoft.com/office/word/2023/wordml/word16du" xmlns:w16sdtdh="http://schemas.microsoft.com/office/word/2020/wordml/sdtdatahash" xmlns:w16sdtfl="http://schemas.microsoft.com/office/word/2024/wordml/sdtformatlock" xmlns:w16se="http://schemas.microsoft.com/office/word/2015/wordml/symex" xmlns:wpg="http://schemas.microsoft.com/office/word/2010/wordprocessingGroup" xmlns:wpi="http://schemas.microsoft.com/office/word/2010/wordprocessingInk" xmlns:wne="http://schemas.microsoft.com/office/word/2006/wordml" xmlns:wps="http://schemas.microsoft.com/office/word/2010/wordprocessingShape" mc:Ignorable="w14 w15 w16se w16cid w16 w16cex w16sdtdh w16sdtfl w16du wp14">
   <w:abstractNum w:abstractNumId="0" w15:restartNumberingAfterBreak="0">
     <w:nsid w:val="01EE439B"/>
     <w:multiLevelType w:val="hybridMultilevel"/>
@@ -22396,7 +22389,7 @@
 </file>
 
 <file path=word/styles.xml><?xml version="1.0" encoding="utf-8"?>
-<w:styles xmlns:mc="http://schemas.openxmlformats.org/markup-compatibility/2006" xmlns:r="http://schemas.openxmlformats.org/officeDocument/2006/relationships" xmlns:w="http://schemas.openxmlformats.org/wordprocessingml/2006/main" xmlns:w14="http://schemas.microsoft.com/office/word/2010/wordml" xmlns:w15="http://schemas.microsoft.com/office/word/2012/wordml" xmlns:w16cex="http://schemas.microsoft.com/office/word/2018/wordml/cex" xmlns:w16cid="http://schemas.microsoft.com/office/word/2016/wordml/cid" xmlns:w16="http://schemas.microsoft.com/office/word/2018/wordml" xmlns:w16sdtdh="http://schemas.microsoft.com/office/word/2020/wordml/sdtdatahash" xmlns:w16sdtfl="http://schemas.microsoft.com/office/word/2024/wordml/sdtformatlock" xmlns:w16se="http://schemas.microsoft.com/office/word/2015/wordml/symex" xmlns:w16du="http://schemas.microsoft.com/office/word/2023/wordml/word16du" mc:Ignorable="w14 w15 w16se w16cid w16 w16cex w16sdtdh w16sdtfl w16du">
+<w:styles xmlns:mc="http://schemas.openxmlformats.org/markup-compatibility/2006" xmlns:r="http://schemas.openxmlformats.org/officeDocument/2006/relationships" xmlns:w="http://schemas.openxmlformats.org/wordprocessingml/2006/main" xmlns:w14="http://schemas.microsoft.com/office/word/2010/wordml" xmlns:w15="http://schemas.microsoft.com/office/word/2012/wordml" xmlns:w16cex="http://schemas.microsoft.com/office/word/2018/wordml/cex" xmlns:w16cid="http://schemas.microsoft.com/office/word/2016/wordml/cid" xmlns:w16="http://schemas.microsoft.com/office/word/2018/wordml" xmlns:w16du="http://schemas.microsoft.com/office/word/2023/wordml/word16du" xmlns:w16sdtdh="http://schemas.microsoft.com/office/word/2020/wordml/sdtdatahash" xmlns:w16sdtfl="http://schemas.microsoft.com/office/word/2024/wordml/sdtformatlock" xmlns:w16se="http://schemas.microsoft.com/office/word/2015/wordml/symex" mc:Ignorable="w14 w15 w16se w16cid w16 w16cex w16sdtdh w16sdtfl w16du">
   <w:docDefaults>
     <w:rPrDefault>
       <w:rPr>
@@ -23833,19 +23826,6 @@
 </file>
 
 <file path=customXml/item1.xml><?xml version="1.0" encoding="utf-8"?>
-<b:Sources xmlns:b="http://schemas.openxmlformats.org/officeDocument/2006/bibliography" xmlns="http://schemas.openxmlformats.org/officeDocument/2006/bibliography" SelectedStyle="\APASixthEditionOfficeOnline.xsl" StyleName="APA" Version="6"/>
-</file>
-
-<file path=customXml/item2.xml><?xml version="1.0" encoding="utf-8"?>
-<?mso-contentType ?>
-<FormTemplates xmlns="http://schemas.microsoft.com/sharepoint/v3/contenttype/forms">
-  <Display>DocumentLibraryForm</Display>
-  <Edit>DocumentLibraryForm</Edit>
-  <New>DocumentLibraryForm</New>
-</FormTemplates>
-</file>
-
-<file path=customXml/item3.xml><?xml version="1.0" encoding="utf-8"?>
 <ct:contentTypeSchema xmlns:ct="http://schemas.microsoft.com/office/2006/metadata/contentType" xmlns:ma="http://schemas.microsoft.com/office/2006/metadata/properties/metaAttributes" ct:_="" ma:_="" ma:contentTypeName="Document" ma:contentTypeID="0x010100095F958C9057D64E8725F7631168A218" ma:contentTypeVersion="24" ma:contentTypeDescription="Create a new document." ma:contentTypeScope="" ma:versionID="0181d0ef269031616f304220f34fcec3">
   <xsd:schema xmlns:xsd="http://www.w3.org/2001/XMLSchema" xmlns:xs="http://www.w3.org/2001/XMLSchema" xmlns:p="http://schemas.microsoft.com/office/2006/metadata/properties" xmlns:ns2="a0846abc-da76-433d-b89e-11ed84fbaeb3" xmlns:ns3="4b0b2adc-e4a8-4832-bb38-e3a7e820179b" targetNamespace="http://schemas.microsoft.com/office/2006/metadata/properties" ma:root="true" ma:fieldsID="8fea1687251d818162f479617e9b8afa" ns2:_="" ns3:_="">
     <xsd:import namespace="a0846abc-da76-433d-b89e-11ed84fbaeb3"/>
@@ -24112,6 +24092,19 @@
 </ct:contentTypeSchema>
 </file>
 
+<file path=customXml/item2.xml><?xml version="1.0" encoding="utf-8"?>
+<?mso-contentType ?>
+<FormTemplates xmlns="http://schemas.microsoft.com/sharepoint/v3/contenttype/forms">
+  <Display>DocumentLibraryForm</Display>
+  <Edit>DocumentLibraryForm</Edit>
+  <New>DocumentLibraryForm</New>
+</FormTemplates>
+</file>
+
+<file path=customXml/item3.xml><?xml version="1.0" encoding="utf-8"?>
+<b:Sources xmlns:b="http://schemas.openxmlformats.org/officeDocument/2006/bibliography" xmlns="http://schemas.openxmlformats.org/officeDocument/2006/bibliography" SelectedStyle="\APASixthEditionOfficeOnline.xsl" StyleName="APA" Version="6"/>
+</file>
+
 <file path=customXml/item4.xml><?xml version="1.0" encoding="utf-8"?>
 <p:properties xmlns:p="http://schemas.microsoft.com/office/2006/metadata/properties" xmlns:xsi="http://www.w3.org/2001/XMLSchema-instance" xmlns:pc="http://schemas.microsoft.com/office/infopath/2007/PartnerControls">
   <documentManagement>
@@ -24125,22 +24118,6 @@
 </file>
 
 <file path=customXml/itemProps1.xml><?xml version="1.0" encoding="utf-8"?>
-<ds:datastoreItem xmlns:ds="http://schemas.openxmlformats.org/officeDocument/2006/customXml" ds:itemID="{31A8F991-F2C3-4A98-93A0-9F15F02E83A7}">
-  <ds:schemaRefs>
-    <ds:schemaRef ds:uri="http://schemas.openxmlformats.org/officeDocument/2006/bibliography"/>
-  </ds:schemaRefs>
-</ds:datastoreItem>
-</file>
-
-<file path=customXml/itemProps2.xml><?xml version="1.0" encoding="utf-8"?>
-<ds:datastoreItem xmlns:ds="http://schemas.openxmlformats.org/officeDocument/2006/customXml" ds:itemID="{B3B23335-743F-4ECA-B591-0D88F7E33FD2}">
-  <ds:schemaRefs>
-    <ds:schemaRef ds:uri="http://schemas.microsoft.com/sharepoint/v3/contenttype/forms"/>
-  </ds:schemaRefs>
-</ds:datastoreItem>
-</file>
-
-<file path=customXml/itemProps3.xml><?xml version="1.0" encoding="utf-8"?>
 <ds:datastoreItem xmlns:ds="http://schemas.openxmlformats.org/officeDocument/2006/customXml" ds:itemID="{F20D8333-D2CC-42A6-B516-87CB1D2A20AC}">
   <ds:schemaRefs>
     <ds:schemaRef ds:uri="http://schemas.microsoft.com/office/2006/metadata/contentType"/>
@@ -24159,6 +24136,22 @@
 </ds:datastoreItem>
 </file>
 
+<file path=customXml/itemProps2.xml><?xml version="1.0" encoding="utf-8"?>
+<ds:datastoreItem xmlns:ds="http://schemas.openxmlformats.org/officeDocument/2006/customXml" ds:itemID="{B3B23335-743F-4ECA-B591-0D88F7E33FD2}">
+  <ds:schemaRefs>
+    <ds:schemaRef ds:uri="http://schemas.microsoft.com/sharepoint/v3/contenttype/forms"/>
+  </ds:schemaRefs>
+</ds:datastoreItem>
+</file>
+
+<file path=customXml/itemProps3.xml><?xml version="1.0" encoding="utf-8"?>
+<ds:datastoreItem xmlns:ds="http://schemas.openxmlformats.org/officeDocument/2006/customXml" ds:itemID="{31A8F991-F2C3-4A98-93A0-9F15F02E83A7}">
+  <ds:schemaRefs>
+    <ds:schemaRef ds:uri="http://schemas.openxmlformats.org/officeDocument/2006/bibliography"/>
+  </ds:schemaRefs>
+</ds:datastoreItem>
+</file>
+
 <file path=customXml/itemProps4.xml><?xml version="1.0" encoding="utf-8"?>
 <ds:datastoreItem xmlns:ds="http://schemas.openxmlformats.org/officeDocument/2006/customXml" ds:itemID="{06AF3FC3-CD02-49E6-93A5-73EE653BBDCC}">
   <ds:schemaRefs>

</xml_diff>